<commit_message>
Repository link in reports added
</commit_message>
<xml_diff>
--- a/REPORTS/LAB 3.docx
+++ b/REPORTS/LAB 3.docx
@@ -1142,6 +1142,9 @@
     <w:p>
       <w:pPr>
         <w:pStyle w:val="1"/>
+        <w:rPr>
+          <w:lang w:val="en-US"/>
+        </w:rPr>
       </w:pPr>
     </w:p>
     <w:p>
@@ -1149,7 +1152,13 @@
         <w:pStyle w:val="1"/>
       </w:pPr>
       <w:r>
-        <w:t xml:space="preserve"> В подсчёт попадали отдельные упоминания </w:t>
+        <w:rPr>
+          <w:lang w:val="en-US"/>
+        </w:rPr>
+        <w:t xml:space="preserve"> </w:t>
+      </w:r>
+      <w:r>
+        <w:t xml:space="preserve">В подсчёт попадали отдельные упоминания </w:t>
       </w:r>
       <w:r>
         <w:t>элемента</w:t>
@@ -1268,13 +1277,7 @@
       </w:r>
       <w:proofErr w:type="gramEnd"/>
       <w:r>
-        <w:t>, поэтому каждый процесс знает полный набор символо</w:t>
-      </w:r>
-      <w:r>
-        <w:t xml:space="preserve">в и </w:t>
-      </w:r>
-      <w:r>
-        <w:t>общий объем работы.</w:t>
+        <w:t>, поэтому каждый процесс знает полный набор символов и общий объем работы.</w:t>
       </w:r>
       <w:r>
         <w:t xml:space="preserve"> </w:t>
@@ -1304,28 +1307,27 @@
       </w:r>
       <w:proofErr w:type="spellEnd"/>
       <w:r>
-        <w:t xml:space="preserve"> </w:t>
-      </w:r>
-      <w:r>
-        <w:t>собственную часть ссылок.</w:t>
-      </w:r>
-      <w:r>
-        <w:t xml:space="preserve"> </w:t>
-      </w:r>
-      <w:r>
-        <w:t xml:space="preserve">Каждый процесс загружает назначенные ему </w:t>
-      </w:r>
-      <w:r>
-        <w:t>страницы, выделяет основной текст и считает вхождения: собс</w:t>
-      </w:r>
-      <w:r>
-        <w:t>твенного символа страницы и всех двухбуквенных символов из общего списка.</w:t>
-      </w:r>
-      <w:r>
-        <w:t xml:space="preserve"> </w:t>
-      </w:r>
-      <w:r>
-        <w:t xml:space="preserve">Результаты собираются на rank 0 через </w:t>
+        <w:t xml:space="preserve"> собственную часть ссылок.</w:t>
+      </w:r>
+      <w:r>
+        <w:t xml:space="preserve"> </w:t>
+      </w:r>
+      <w:r>
+        <w:t>Каждый процесс загружает назначенные ему страницы, выделяет основной текст и считает вхождения: собственного символа страницы и всех двухбуквенных символов из общего списка.</w:t>
+      </w:r>
+      <w:r>
+        <w:t xml:space="preserve"> </w:t>
+      </w:r>
+      <w:r>
+        <w:t xml:space="preserve">Результаты собираются на </w:t>
+      </w:r>
+      <w:proofErr w:type="spellStart"/>
+      <w:r>
+        <w:t>rank</w:t>
+      </w:r>
+      <w:proofErr w:type="spellEnd"/>
+      <w:r>
+        <w:t xml:space="preserve"> 0 через </w:t>
       </w:r>
       <w:proofErr w:type="spellStart"/>
       <w:proofErr w:type="gramStart"/>
@@ -1350,10 +1352,7 @@
         <w:t>топ</w:t>
       </w:r>
       <w:r>
-        <w:t>-5 символов по суммарным упоминаниям на вс</w:t>
-      </w:r>
-      <w:r>
-        <w:t>ех страницах.</w:t>
+        <w:t>-5 символов по суммарным упоминаниям на всех страницах.</w:t>
       </w:r>
     </w:p>
     <w:p>
@@ -1370,10 +1369,7 @@
         <w:pStyle w:val="1"/>
       </w:pPr>
       <w:r>
-        <w:t>Функция parse_periodic_table работает только с основным блоком страницы Wikipedia и отбирает ссылки, текст которых совпадает с шаблоном двухбуквенного химического символа. Словарь symbols устраняет повторяющиеся с</w:t>
-      </w:r>
-      <w:r>
-        <w:t>сылки, после чего результат сортируется по символу.</w:t>
+        <w:t>Функция parse_periodic_table работает только с основным блоком страницы Wikipedia и отбирает ссылки, текст которых совпадает с шаблоном двухбуквенного химического символа. Словарь symbols устраняет повторяющиеся ссылки, после чего результат сортируется по символу.</w:t>
       </w:r>
     </w:p>
     <w:p>
@@ -1976,7 +1972,7 @@
           <w:color w:val="BBBEBF"/>
           <w:sz w:val="21"/>
           <w:szCs w:val="21"/>
-          <w:lang w:eastAsia="ru-RU"/>
+          <w:lang w:val="en-US" w:eastAsia="ru-RU"/>
         </w:rPr>
       </w:pPr>
       <w:r>
@@ -1995,7 +1991,7 @@
           <w:color w:val="BBBEBF"/>
           <w:sz w:val="21"/>
           <w:szCs w:val="21"/>
-          <w:lang w:eastAsia="ru-RU"/>
+          <w:lang w:val="en-US" w:eastAsia="ru-RU"/>
         </w:rPr>
         <w:t xml:space="preserve"> </w:t>
       </w:r>
@@ -2015,7 +2011,7 @@
           <w:color w:val="BBBEBF"/>
           <w:sz w:val="21"/>
           <w:szCs w:val="21"/>
-          <w:lang w:eastAsia="ru-RU"/>
+          <w:lang w:val="en-US" w:eastAsia="ru-RU"/>
         </w:rPr>
         <w:t xml:space="preserve"> </w:t>
       </w:r>
@@ -2035,7 +2031,7 @@
           <w:color w:val="BBBEBF"/>
           <w:sz w:val="21"/>
           <w:szCs w:val="21"/>
-          <w:lang w:eastAsia="ru-RU"/>
+          <w:lang w:val="en-US" w:eastAsia="ru-RU"/>
         </w:rPr>
         <w:t xml:space="preserve"> </w:t>
       </w:r>
@@ -2055,7 +2051,7 @@
           <w:color w:val="BBBEBF"/>
           <w:sz w:val="21"/>
           <w:szCs w:val="21"/>
-          <w:lang w:eastAsia="ru-RU"/>
+          <w:lang w:val="en-US" w:eastAsia="ru-RU"/>
         </w:rPr>
         <w:t xml:space="preserve"> </w:t>
       </w:r>
@@ -2075,7 +2071,7 @@
           <w:color w:val="BBBEBF"/>
           <w:sz w:val="21"/>
           <w:szCs w:val="21"/>
-          <w:lang w:eastAsia="ru-RU"/>
+          <w:lang w:val="en-US" w:eastAsia="ru-RU"/>
         </w:rPr>
         <w:t xml:space="preserve"> </w:t>
       </w:r>
@@ -2098,20 +2094,50 @@
           <w:color w:val="BBBEBF"/>
           <w:sz w:val="21"/>
           <w:szCs w:val="21"/>
+          <w:lang w:val="en-US" w:eastAsia="ru-RU"/>
+        </w:rPr>
+        <w:t>(</w:t>
+      </w:r>
+      <w:proofErr w:type="gramEnd"/>
+      <w:r>
+        <w:rPr>
+          <w:rFonts w:ascii="Consolas" w:hAnsi="Consolas"/>
+          <w:color w:val="A5D6FF"/>
+          <w:sz w:val="21"/>
+          <w:szCs w:val="21"/>
+          <w:lang w:val="en-US" w:eastAsia="ru-RU"/>
+        </w:rPr>
+        <w:t>"</w:t>
+      </w:r>
+      <w:r>
+        <w:rPr>
+          <w:rFonts w:ascii="Consolas" w:hAnsi="Consolas"/>
+          <w:color w:val="A5D6FF"/>
+          <w:sz w:val="21"/>
+          <w:szCs w:val="21"/>
           <w:lang w:eastAsia="ru-RU"/>
         </w:rPr>
-        <w:t>(</w:t>
-      </w:r>
-      <w:proofErr w:type="gramEnd"/>
+        <w:t>Не</w:t>
+      </w:r>
       <w:r>
         <w:rPr>
           <w:rFonts w:ascii="Consolas" w:hAnsi="Consolas"/>
           <w:color w:val="A5D6FF"/>
           <w:sz w:val="21"/>
           <w:szCs w:val="21"/>
+          <w:lang w:val="en-US" w:eastAsia="ru-RU"/>
+        </w:rPr>
+        <w:t xml:space="preserve"> </w:t>
+      </w:r>
+      <w:r>
+        <w:rPr>
+          <w:rFonts w:ascii="Consolas" w:hAnsi="Consolas"/>
+          <w:color w:val="A5D6FF"/>
+          <w:sz w:val="21"/>
+          <w:szCs w:val="21"/>
           <w:lang w:eastAsia="ru-RU"/>
         </w:rPr>
-        <w:t>"</w:t>
+        <w:t>получилось</w:t>
       </w:r>
       <w:r>
         <w:rPr>
@@ -2119,9 +2145,19 @@
           <w:color w:val="A5D6FF"/>
           <w:sz w:val="21"/>
           <w:szCs w:val="21"/>
+          <w:lang w:val="en-US" w:eastAsia="ru-RU"/>
+        </w:rPr>
+        <w:t xml:space="preserve"> </w:t>
+      </w:r>
+      <w:r>
+        <w:rPr>
+          <w:rFonts w:ascii="Consolas" w:hAnsi="Consolas"/>
+          <w:color w:val="A5D6FF"/>
+          <w:sz w:val="21"/>
+          <w:szCs w:val="21"/>
           <w:lang w:eastAsia="ru-RU"/>
         </w:rPr>
-        <w:t>Не получилось получить</w:t>
+        <w:t>получить</w:t>
       </w:r>
       <w:r>
         <w:rPr>
@@ -2129,7 +2165,7 @@
           <w:color w:val="A5D6FF"/>
           <w:sz w:val="21"/>
           <w:szCs w:val="21"/>
-          <w:lang w:eastAsia="ru-RU"/>
+          <w:lang w:val="en-US" w:eastAsia="ru-RU"/>
         </w:rPr>
         <w:t>."</w:t>
       </w:r>
@@ -2139,7 +2175,7 @@
           <w:color w:val="BBBEBF"/>
           <w:sz w:val="21"/>
           <w:szCs w:val="21"/>
-          <w:lang w:eastAsia="ru-RU"/>
+          <w:lang w:val="en-US" w:eastAsia="ru-RU"/>
         </w:rPr>
         <w:t>)</w:t>
       </w:r>
@@ -2154,7 +2190,7 @@
           <w:color w:val="BBBEBF"/>
           <w:sz w:val="21"/>
           <w:szCs w:val="21"/>
-          <w:lang w:eastAsia="ru-RU"/>
+          <w:lang w:val="en-US" w:eastAsia="ru-RU"/>
         </w:rPr>
       </w:pPr>
     </w:p>
@@ -2187,7 +2223,7 @@
           <w:color w:val="BBBEBF"/>
           <w:sz w:val="21"/>
           <w:szCs w:val="21"/>
-          <w:lang w:eastAsia="ru-RU"/>
+          <w:lang w:val="en-US" w:eastAsia="ru-RU"/>
         </w:rPr>
         <w:t xml:space="preserve"> </w:t>
       </w:r>
@@ -2207,7 +2243,7 @@
           <w:color w:val="BBBEBF"/>
           <w:sz w:val="21"/>
           <w:szCs w:val="21"/>
-          <w:lang w:eastAsia="ru-RU"/>
+          <w:lang w:val="en-US" w:eastAsia="ru-RU"/>
         </w:rPr>
         <w:t xml:space="preserve"> </w:t>
       </w:r>
@@ -3479,10 +3515,7 @@
         <w:pStyle w:val="a1"/>
       </w:pPr>
       <w:r>
-        <w:t>В</w:t>
-      </w:r>
-      <w:r>
-        <w:t>ыделение основного текста страницы</w:t>
+        <w:t>Выделение основного текста страницы</w:t>
       </w:r>
     </w:p>
     <w:p>
@@ -5428,24 +5461,15 @@
         <w:pStyle w:val="a1"/>
       </w:pPr>
       <w:r>
-        <w:t>П</w:t>
-      </w:r>
-      <w:r>
-        <w:t>одсчет вхождений символов</w:t>
+        <w:t>Подсчет вхождений символов</w:t>
       </w:r>
     </w:p>
     <w:p>
       <w:pPr>
         <w:pStyle w:val="1"/>
-        <w:rPr>
-          <w:lang w:val="en-US"/>
-        </w:rPr>
-      </w:pPr>
-      <w:r>
-        <w:t xml:space="preserve">Подсчет выполняется регулярным выражением: символ не должен быть частью обычного английского слова слева, а справа допускаются границы, пробелы, знаки </w:t>
-      </w:r>
-      <w:r>
-        <w:t xml:space="preserve">препинания, цифры и заглавные буквы. </w:t>
+      </w:pPr>
+      <w:r>
+        <w:t xml:space="preserve">Подсчет выполняется регулярным выражением: символ не должен быть частью обычного английского слова слева, а справа допускаются границы, пробелы, знаки препинания, цифры и заглавные буквы. </w:t>
       </w:r>
     </w:p>
     <w:p>
@@ -6057,6 +6081,9 @@
     <w:p>
       <w:pPr>
         <w:pStyle w:val="1"/>
+        <w:rPr>
+          <w:lang w:val="en-US"/>
+        </w:rPr>
       </w:pPr>
     </w:p>
     <w:p>
@@ -6064,22 +6091,7 @@
         <w:pStyle w:val="1"/>
       </w:pPr>
       <w:r>
-        <w:t>Далее</w:t>
-      </w:r>
-      <w:r>
-        <w:t> обрабатывает</w:t>
-      </w:r>
-      <w:r>
-        <w:t>ся</w:t>
-      </w:r>
-      <w:r>
-        <w:t xml:space="preserve"> список страниц, назначенных текущему MPI-процессу. Для каждой пары</w:t>
-      </w:r>
-      <w:r>
-        <w:t xml:space="preserve"> элемент-ссылка, </w:t>
-      </w:r>
-      <w:r>
-        <w:t>загружает HTML страницы элемента, извлекает из него основной текст статьи и считает, сколько раз на этой странице встречается собственный символ элемента. Затем она дополнительно считает в этом же тексте вхождения всех двухбуквенных символов из общего списка. Для каждой страницы функция сохраняет результат, где хранятся символ, ссылка, число собственных вхождений и словарь всех подсчетов. В конце возвращается список таких результатов, который затем собирается главным MPI-процессом</w:t>
+        <w:t>Далее обрабатывается список страниц, назначенных текущему MPI-процессу. Для каждой пары элемент-ссылка, загружает HTML страницы элемента, извлекает из него основной текст статьи и считает, сколько раз на этой странице встречается собственный символ элемента. Затем она дополнительно считает в этом же тексте вхождения всех двухбуквенных символов из общего списка. Для каждой страницы функция сохраняет результат, где хранятся символ, ссылка, число собственных вхождений и словарь всех подсчетов. В конце возвращается список таких результатов, который затем собирается главным MPI-процессом</w:t>
       </w:r>
     </w:p>
     <w:p>
@@ -6474,7 +6486,7 @@
           <w:color w:val="BBBEBF"/>
           <w:sz w:val="21"/>
           <w:szCs w:val="21"/>
-          <w:lang w:eastAsia="ru-RU"/>
+          <w:lang w:val="en-US" w:eastAsia="ru-RU"/>
         </w:rPr>
       </w:pPr>
       <w:r>
@@ -7550,10 +7562,7 @@
         <w:pStyle w:val="a1"/>
       </w:pPr>
       <w:r>
-        <w:t>M</w:t>
-      </w:r>
-      <w:r>
-        <w:t>PI-распределение и агрегация</w:t>
+        <w:t>MPI-распределение и агрегация</w:t>
       </w:r>
     </w:p>
     <w:p>
@@ -7562,10 +7571,7 @@
       </w:pPr>
       <w:r>
         <w:lastRenderedPageBreak/>
-        <w:t xml:space="preserve">В MPI-части один процесс отвечает за начальную загрузку списка задач, а затем все процессы независимо обрабатывают свои страницы. Итоговая сортировка выполняется только </w:t>
-      </w:r>
-      <w:r>
-        <w:t>на rank 0, чтобы исключить конфликт вывода и собрать единую таблицу результатов.</w:t>
+        <w:t>В MPI-части один процесс отвечает за начальную загрузку списка задач, а затем все процессы независимо обрабатывают свои страницы. Итоговая сортировка выполняется только на rank 0, чтобы исключить конфликт вывода и собрать единую таблицу результатов.</w:t>
       </w:r>
     </w:p>
     <w:p>
@@ -11358,10 +11364,7 @@
         </w:rPr>
       </w:pPr>
       <w:r>
-        <w:t>Р</w:t>
-      </w:r>
-      <w:r>
-        <w:t>езультаты обработки</w:t>
+        <w:t>Результаты обработки</w:t>
       </w:r>
     </w:p>
     <w:p>
@@ -11579,23 +11582,7 @@
                 <w:szCs w:val="24"/>
                 <w:lang w:val="en-US"/>
               </w:rPr>
-              <w:t>TM) i5-13500H</w:t>
-            </w:r>
-            <w:r>
-              <w:rPr>
-                <w:sz w:val="24"/>
-                <w:szCs w:val="24"/>
-                <w:lang w:val="en-US"/>
-              </w:rPr>
-              <w:t xml:space="preserve"> </w:t>
-            </w:r>
-            <w:r>
-              <w:rPr>
-                <w:sz w:val="24"/>
-                <w:szCs w:val="24"/>
-                <w:lang w:val="en-US"/>
-              </w:rPr>
-              <w:t xml:space="preserve">12 </w:t>
+              <w:t xml:space="preserve">TM) i5-13500H 12 </w:t>
             </w:r>
             <w:r>
               <w:rPr>
@@ -12543,10 +12530,7 @@
         <w:pStyle w:val="a0"/>
       </w:pPr>
       <w:r>
-        <w:t xml:space="preserve">Описание </w:t>
-      </w:r>
-      <w:r>
-        <w:t>производительности программы</w:t>
+        <w:t>Описание производительности программы</w:t>
       </w:r>
     </w:p>
     <w:p>
@@ -12920,10 +12904,7 @@
         <w:pStyle w:val="1"/>
       </w:pPr>
       <w:r>
-        <w:t xml:space="preserve">С ростом числа процессов время уменьшилось с 32.463 с до 9.926 с. Ускорение относительно запуска на 2 </w:t>
-      </w:r>
-      <w:r>
-        <w:t xml:space="preserve">процессах составило примерно 3.27 раза при 6 процессах. </w:t>
+        <w:t xml:space="preserve">С ростом числа процессов время уменьшилось с 32.463 с до 9.926 с. Ускорение относительно запуска на 2 процессах составило примерно 3.27 раза при 6 процессах. </w:t>
       </w:r>
     </w:p>
     <w:p>
@@ -12955,10 +12936,7 @@
         <w:pStyle w:val="1"/>
       </w:pPr>
       <w:r>
-        <w:t xml:space="preserve">В ходе лабораторной работы разработана MPI-программа для распределенного анализа веб-страниц. Главный процесс получает список страниц химических элементов с двухбуквенными символами, передает его всем </w:t>
-      </w:r>
-      <w:r>
-        <w:t>процессам, после чего страницы обрабатываются параллельно.</w:t>
+        <w:t>В ходе лабораторной работы разработана MPI-программа для распределенного анализа веб-страниц. Главный процесс получает список страниц химических элементов с двухбуквенными символами, передает его всем процессам, после чего страницы обрабатываются параллельно.</w:t>
       </w:r>
     </w:p>
     <w:p>
@@ -12966,10 +12944,7 @@
         <w:pStyle w:val="1"/>
       </w:pPr>
       <w:r>
-        <w:t>Программа</w:t>
-      </w:r>
-      <w:r>
-        <w:t xml:space="preserve"> исключает служебные блоки Wikipedia, считает вхождения символов на страницах и формирует два требуемых</w:t>
+        <w:t>Программа исключает служебные блоки Wikipedia, считает вхождения символов на страницах и формирует два требуемых</w:t>
       </w:r>
       <w:r>
         <w:t xml:space="preserve"> топа</w:t>
@@ -12981,10 +12956,7 @@
         <w:t>,</w:t>
       </w:r>
       <w:r>
-        <w:t xml:space="preserve"> наибольшее число</w:t>
-      </w:r>
-      <w:r>
-        <w:t xml:space="preserve"> собственных вхождений получено для Np, Am, Cm, Cl и Sm, а по суммарным упоминаниям лидируют In, As, Np, Cl и Cm.</w:t>
+        <w:t xml:space="preserve"> наибольшее число собственных вхождений получено для Np, Am, Cm, Cl и Sm, а по суммарным упоминаниям лидируют In, As, Np, Cl и Cm.</w:t>
       </w:r>
     </w:p>
     <w:p>
@@ -12992,19 +12964,45 @@
         <w:pStyle w:val="1"/>
       </w:pPr>
       <w:r>
-        <w:t>Тестирование на 2, 3 и 6 процессах показало сокращение времени выполнения при увеличении числа процессов. Это подтверждает целесообразность ра</w:t>
-      </w:r>
-      <w:r>
-        <w:t>спределения независимых веб-страниц между процессами MPI, особенно когда значительную часть времени занимают сетевые запросы и парсинг HTML.</w:t>
-      </w:r>
+        <w:t>Тестирование на 2, 3 и 6 процессах показало сокращение времени выполнения при увеличении числа процессов. Это подтверждает целесообразность распределения независимых веб-страниц между процессами MPI, особенно когда значительную часть времени занимают сетевые запросы и парсинг HTML.</w:t>
+      </w:r>
+    </w:p>
+    <w:p>
+      <w:pPr>
+        <w:pStyle w:val="1"/>
+        <w:rPr>
+          <w:sz w:val="28"/>
+          <w:szCs w:val="28"/>
+        </w:rPr>
+      </w:pPr>
+      <w:r>
+        <w:t xml:space="preserve">Код выполнения предоставлен на </w:t>
+      </w:r>
+      <w:hyperlink r:id="rId10" w:history="1">
+        <w:r>
+          <w:rPr>
+            <w:rStyle w:val="ae"/>
+            <w:lang w:val="en-US"/>
+          </w:rPr>
+          <w:t>GitHub</w:t>
+        </w:r>
+      </w:hyperlink>
+      <w:r>
+        <w:t>.</w:t>
+      </w:r>
+    </w:p>
+    <w:p>
+      <w:pPr>
+        <w:pStyle w:val="1"/>
+      </w:pPr>
     </w:p>
     <w:sectPr>
-      <w:headerReference w:type="even" r:id="rId10"/>
-      <w:headerReference w:type="default" r:id="rId11"/>
-      <w:footerReference w:type="even" r:id="rId12"/>
-      <w:footerReference w:type="default" r:id="rId13"/>
-      <w:headerReference w:type="first" r:id="rId14"/>
-      <w:footerReference w:type="first" r:id="rId15"/>
+      <w:headerReference w:type="even" r:id="rId11"/>
+      <w:headerReference w:type="default" r:id="rId12"/>
+      <w:footerReference w:type="even" r:id="rId13"/>
+      <w:footerReference w:type="default" r:id="rId14"/>
+      <w:headerReference w:type="first" r:id="rId15"/>
+      <w:footerReference w:type="first" r:id="rId16"/>
       <w:pgSz w:w="11906" w:h="16838"/>
       <w:pgMar w:top="1134" w:right="850" w:bottom="1134" w:left="1701" w:header="708" w:footer="708" w:gutter="0"/>
       <w:cols w:space="708"/>
@@ -13393,6 +13391,7 @@
   <w:latentStyles w:defLockedState="0" w:defUIPriority="99" w:defSemiHidden="0" w:defUnhideWhenUsed="0" w:defQFormat="0" w:count="376">
     <w:lsdException w:name="Normal" w:uiPriority="0"/>
     <w:lsdException w:name="HTML Keyboard" w:semiHidden="1" w:unhideWhenUsed="1"/>
+    <w:lsdException w:name="Normal Table" w:semiHidden="1" w:unhideWhenUsed="1"/>
     <w:lsdException w:name="annotation subject" w:semiHidden="1" w:unhideWhenUsed="1"/>
     <w:lsdException w:name="No List" w:semiHidden="1" w:unhideWhenUsed="1"/>
     <w:lsdException w:name="Outline List 1" w:semiHidden="1" w:unhideWhenUsed="1"/>
@@ -13435,8 +13434,11 @@
     <w:lsdException w:name="Table Contemporary" w:semiHidden="1" w:unhideWhenUsed="1"/>
     <w:lsdException w:name="Table Elegant" w:semiHidden="1" w:unhideWhenUsed="1"/>
     <w:lsdException w:name="Table Professional" w:semiHidden="1" w:unhideWhenUsed="1"/>
+    <w:lsdException w:name="Table Subtle 1" w:semiHidden="1" w:unhideWhenUsed="1"/>
     <w:lsdException w:name="Table Subtle 2" w:semiHidden="1" w:unhideWhenUsed="1"/>
     <w:lsdException w:name="Table Web 1" w:semiHidden="1" w:unhideWhenUsed="1"/>
+    <w:lsdException w:name="Table Web 2" w:semiHidden="1" w:unhideWhenUsed="1"/>
+    <w:lsdException w:name="Table Web 3" w:semiHidden="1" w:unhideWhenUsed="1"/>
     <w:lsdException w:name="Balloon Text" w:semiHidden="1" w:unhideWhenUsed="1"/>
     <w:lsdException w:name="Table Theme" w:semiHidden="1" w:unhideWhenUsed="1"/>
     <w:lsdException w:name="Placeholder Text" w:semiHidden="1"/>
@@ -13455,6 +13457,10 @@
     <w:lsdException w:name="Colorful List"/>
     <w:lsdException w:name="Colorful Grid"/>
     <w:lsdException w:name="Light Shading Accent 1"/>
+    <w:lsdException w:name="Light List Accent 1"/>
+    <w:lsdException w:name="Light Grid Accent 1"/>
+    <w:lsdException w:name="Medium Shading 1 Accent 1"/>
+    <w:lsdException w:name="Medium Shading 2 Accent 1"/>
     <w:lsdException w:name="Medium List 1 Accent 1"/>
     <w:lsdException w:name="Revision" w:semiHidden="1"/>
     <w:lsdException w:name="Medium List 2 Accent 1"/>
@@ -13530,6 +13536,11 @@
     <w:lsdException w:name="Medium List 2 Accent 6"/>
     <w:lsdException w:name="Medium Grid 1 Accent 6"/>
     <w:lsdException w:name="Medium Grid 2 Accent 6"/>
+    <w:lsdException w:name="Medium Grid 3 Accent 6"/>
+    <w:lsdException w:name="Dark List Accent 6"/>
+    <w:lsdException w:name="Colorful Shading Accent 6"/>
+    <w:lsdException w:name="Colorful List Accent 6"/>
+    <w:lsdException w:name="Colorful Grid Accent 6"/>
     <w:lsdException w:name="Bibliography" w:semiHidden="1" w:unhideWhenUsed="1"/>
     <w:lsdException w:name="TOC Heading" w:semiHidden="1" w:unhideWhenUsed="1"/>
     <w:lsdException w:name="Mention" w:semiHidden="1" w:unhideWhenUsed="1"/>
@@ -13553,6 +13564,7 @@
   <w:style w:type="character" w:default="1" w:styleId="a4">
     <w:name w:val="Default Paragraph Font"/>
     <w:uiPriority w:val="1"/>
+    <w:semiHidden/>
     <w:unhideWhenUsed/>
   </w:style>
   <w:style w:type="table" w:default="1" w:styleId="a5">

</xml_diff>